<commit_message>
Worked on 'corrappln' merge and finished 'incorrectfilerect' merge.
</commit_message>
<xml_diff>
--- a/project/documents/communications/incorrectfilerect.docx
+++ b/project/documents/communications/incorrectfilerect.docx
@@ -561,44 +561,55 @@
           <w:sz w:val="24"/>
         </w:rPr>
       </w:pPr>
-      <w:r>
-        <w:rPr>
-          <w:noProof/>
-          <w:sz w:val="24"/>
-        </w:rPr>
-        <w:t>Minn</w:t>
-      </w:r>
-      <w:r>
-        <w:rPr>
-          <w:noProof/>
-          <w:sz w:val="24"/>
-        </w:rPr>
-        <w:t xml:space="preserve">eapolis, </w:t>
-      </w:r>
-      <w:smartTag w:uri="urn:schemas-microsoft-com:office:smarttags" w:element="State">
+      <w:smartTag w:uri="urn:schemas-microsoft-com:office:smarttags" w:element="country-region">
+        <w:smartTag w:uri="urn:schemas-microsoft-com:office:smarttags" w:element="City">
+          <w:r>
+            <w:rPr>
+              <w:noProof/>
+              <w:sz w:val="24"/>
+            </w:rPr>
+            <w:t>Minn</w:t>
+          </w:r>
+          <w:r>
+            <w:rPr>
+              <w:noProof/>
+              <w:sz w:val="24"/>
+            </w:rPr>
+            <w:t>eapolis</w:t>
+          </w:r>
+        </w:smartTag>
         <w:r>
           <w:rPr>
             <w:noProof/>
             <w:sz w:val="24"/>
           </w:rPr>
-          <w:t>MN</w:t>
+          <w:t xml:space="preserve">, </w:t>
         </w:r>
-      </w:smartTag>
-      <w:r>
-        <w:rPr>
-          <w:noProof/>
-          <w:sz w:val="24"/>
-        </w:rPr>
-        <w:t xml:space="preserve">  </w:t>
-      </w:r>
-      <w:smartTag w:uri="urn:schemas-microsoft-com:office:smarttags" w:element="PostalCode">
+        <w:smartTag w:uri="urn:schemas-microsoft-com:office:smarttags" w:element="State">
+          <w:r>
+            <w:rPr>
+              <w:noProof/>
+              <w:sz w:val="24"/>
+            </w:rPr>
+            <w:t>MN</w:t>
+          </w:r>
+        </w:smartTag>
         <w:r>
           <w:rPr>
             <w:noProof/>
             <w:sz w:val="24"/>
           </w:rPr>
-          <w:t>55402</w:t>
+          <w:t xml:space="preserve">  </w:t>
         </w:r>
+        <w:smartTag w:uri="urn:schemas-microsoft-com:office:smarttags" w:element="PostalCode">
+          <w:r>
+            <w:rPr>
+              <w:noProof/>
+              <w:sz w:val="24"/>
+            </w:rPr>
+            <w:t>55402</w:t>
+          </w:r>
+        </w:smartTag>
       </w:smartTag>
     </w:p>
     <w:p>
@@ -643,7 +654,7 @@
           <w:noProof/>
           <w:sz w:val="24"/>
         </w:rPr>
-        <w:t xml:space="preserve">         </w:t>
+        <w:t xml:space="preserve">        </w:t>
       </w:r>
       <w:r>
         <w:rPr>
@@ -789,212 +800,47 @@
     </w:p>
     <w:p>
       <w:pPr>
-        <w:rPr>
-          <w:noProof/>
-          <w:sz w:val="18"/>
-          <w:szCs w:val="18"/>
-        </w:rPr>
-      </w:pPr>
-      <w:r>
-        <w:rPr>
-          <w:sz w:val="18"/>
-          <w:szCs w:val="18"/>
+        <w:pStyle w:val="CommentText"/>
+        <w:tabs>
+          <w:tab w:val="left" w:pos="5040"/>
+        </w:tabs>
+        <w:rPr>
+          <w:noProof/>
+          <w:szCs w:val="24"/>
+        </w:rPr>
+      </w:pPr>
+      <w:r>
+        <w:rPr>
+          <w:noProof/>
+          <w:sz w:val="16"/>
+          <w:szCs w:val="24"/>
+        </w:rPr>
+        <w:br w:type="page"/>
+      </w:r>
+    </w:p>
+    <w:p>
+      <w:pPr>
+        <w:tabs>
+          <w:tab w:val="center" w:pos="5400"/>
+        </w:tabs>
+        <w:rPr>
+          <w:rFonts w:cs="Times New Roman TUR"/>
+          <w:sz w:val="24"/>
+        </w:rPr>
+      </w:pPr>
+      <w:r>
+        <w:rPr>
+          <w:rFonts w:cs="Times New Roman TUR"/>
+          <w:sz w:val="24"/>
+        </w:rPr>
+        <w:tab/>
+      </w:r>
+      <w:r>
+        <w:rPr>
+          <w:rFonts w:cs="Times New Roman TUR"/>
+          <w:sz w:val="24"/>
           <w:u w:val="single"/>
         </w:rPr>
-        <w:t>CERTIFICATE UNDER 37 CFR 1.8</w:t>
-      </w:r>
-      <w:r>
-        <w:rPr>
-          <w:sz w:val="18"/>
-          <w:szCs w:val="18"/>
-        </w:rPr>
-        <w:t xml:space="preserve">:  The undersigned hereby certifies that this correspondence is being </w:t>
-      </w:r>
-      <w:r>
-        <w:rPr>
-          <w:noProof/>
-          <w:sz w:val="18"/>
-          <w:szCs w:val="18"/>
-        </w:rPr>
-        <w:t>&lt;&lt;certificateText&gt;&gt;</w:t>
-      </w:r>
-      <w:r>
-        <w:rPr>
-          <w:sz w:val="18"/>
-          <w:szCs w:val="18"/>
-        </w:rPr>
-        <w:t xml:space="preserve"> addressed to:  </w:t>
-      </w:r>
-      <w:r>
-        <w:rPr>
-          <w:sz w:val="18"/>
-          <w:szCs w:val="18"/>
-        </w:rPr>
-        <w:t xml:space="preserve">Commissioner for Patents, P.O. Box 1450, Alexandria, VA 22313-1450 on this </w:t>
-      </w:r>
-      <w:r>
-        <w:rPr>
-          <w:sz w:val="18"/>
-          <w:szCs w:val="18"/>
-          <w:u w:val="single"/>
-        </w:rPr>
-        <w:t xml:space="preserve">          </w:t>
-      </w:r>
-      <w:r>
-        <w:rPr>
-          <w:sz w:val="18"/>
-          <w:szCs w:val="18"/>
-        </w:rPr>
-        <w:t xml:space="preserve"> day of</w:t>
-      </w:r>
-      <w:r>
-        <w:rPr>
-          <w:sz w:val="18"/>
-          <w:szCs w:val="18"/>
-        </w:rPr>
-        <w:t xml:space="preserve"> &lt;&lt;currentMo&gt;&gt;</w:t>
-      </w:r>
-      <w:r>
-        <w:rPr>
-          <w:sz w:val="18"/>
-          <w:szCs w:val="18"/>
-        </w:rPr>
-        <w:t>,</w:t>
-      </w:r>
-      <w:r>
-        <w:rPr>
-          <w:sz w:val="18"/>
-          <w:szCs w:val="18"/>
-        </w:rPr>
-        <w:t xml:space="preserve"> &lt;&lt;currentYr&gt;&gt;</w:t>
-      </w:r>
-      <w:r>
-        <w:rPr>
-          <w:noProof/>
-          <w:sz w:val="18"/>
-          <w:szCs w:val="18"/>
-        </w:rPr>
-        <w:t>.</w:t>
-      </w:r>
-    </w:p>
-    <w:p>
-      <w:pPr>
-        <w:rPr>
-          <w:noProof/>
-          <w:sz w:val="18"/>
-          <w:szCs w:val="18"/>
-        </w:rPr>
-      </w:pPr>
-    </w:p>
-    <w:p>
-      <w:pPr>
-        <w:pStyle w:val="CommentText"/>
-        <w:tabs>
-          <w:tab w:val="left" w:pos="5040"/>
-        </w:tabs>
-        <w:rPr>
-          <w:noProof/>
-          <w:sz w:val="18"/>
-          <w:szCs w:val="18"/>
-        </w:rPr>
-      </w:pPr>
-      <w:r>
-        <w:rPr>
-          <w:noProof/>
-          <w:sz w:val="18"/>
-          <w:szCs w:val="18"/>
-        </w:rPr>
-        <w:t>________________________________________</w:t>
-      </w:r>
-      <w:r>
-        <w:rPr>
-          <w:noProof/>
-          <w:sz w:val="18"/>
-          <w:szCs w:val="18"/>
-        </w:rPr>
-        <w:tab/>
-        <w:t>__________________</w:t>
-      </w:r>
-      <w:r>
-        <w:rPr>
-          <w:noProof/>
-          <w:sz w:val="18"/>
-          <w:szCs w:val="18"/>
-        </w:rPr>
-        <w:t>___________________________</w:t>
-      </w:r>
-    </w:p>
-    <w:p>
-      <w:pPr>
-        <w:pStyle w:val="CommentText"/>
-        <w:tabs>
-          <w:tab w:val="left" w:pos="5040"/>
-        </w:tabs>
-        <w:rPr>
-          <w:noProof/>
-          <w:sz w:val="18"/>
-          <w:szCs w:val="18"/>
-        </w:rPr>
-      </w:pPr>
-      <w:r>
-        <w:rPr>
-          <w:noProof/>
-          <w:sz w:val="18"/>
-          <w:szCs w:val="18"/>
-        </w:rPr>
-        <w:t>Name</w:t>
-      </w:r>
-      <w:r>
-        <w:rPr>
-          <w:noProof/>
-          <w:sz w:val="18"/>
-          <w:szCs w:val="18"/>
-        </w:rPr>
-        <w:tab/>
-        <w:t>Signature</w:t>
-      </w:r>
-    </w:p>
-    <w:p>
-      <w:pPr>
-        <w:tabs>
-          <w:tab w:val="center" w:pos="5400"/>
-        </w:tabs>
-        <w:jc w:val="center"/>
-        <w:rPr>
-          <w:rFonts w:cs="Times New Roman TUR"/>
-          <w:sz w:val="24"/>
-          <w:u w:val="single"/>
-        </w:rPr>
-        <w:sectPr>
-          <w:endnotePr>
-            <w:numFmt w:val="decimal"/>
-          </w:endnotePr>
-          <w:pgSz w:w="12240" w:h="15840" w:code="1"/>
-          <w:pgMar w:top="720" w:right="1440" w:bottom="720" w:left="1440" w:header="1440" w:footer="1440" w:gutter="0"/>
-          <w:paperSrc w:first="11" w:other="11"/>
-          <w:cols w:space="720"/>
-          <w:noEndnote/>
-        </w:sectPr>
-      </w:pPr>
-    </w:p>
-    <w:p>
-      <w:pPr>
-        <w:tabs>
-          <w:tab w:val="center" w:pos="5400"/>
-        </w:tabs>
-        <w:jc w:val="center"/>
-        <w:rPr>
-          <w:rFonts w:cs="Times New Roman TUR"/>
-          <w:sz w:val="24"/>
-        </w:rPr>
-      </w:pPr>
-      <w:r>
-        <w:rPr>
-          <w:rFonts w:cs="Times New Roman TUR"/>
-          <w:sz w:val="24"/>
-          <w:u w:val="single"/>
-        </w:rPr>
-        <w:lastRenderedPageBreak/>
         <w:t>IN THE UNITED STATES PATENT AND TRADEMARK OFFICE</w:t>
       </w:r>
     </w:p>
@@ -1362,8 +1208,8 @@
           <w:tab w:val="clear" w:pos="-1440"/>
         </w:tabs>
       </w:pPr>
-      <w:smartTag w:uri="urn:schemas-microsoft-com:office:smarttags" w:element="place">
-        <w:smartTag w:uri="urn:schemas-microsoft-com:office:smarttags" w:element="country-region">
+      <w:smartTag w:uri="urn:schemas-microsoft-com:office:smarttags" w:element="country-region">
+        <w:smartTag w:uri="urn:schemas-microsoft-com:office:smarttags" w:element="City">
           <w:r>
             <w:t>Alexandria</w:t>
           </w:r>
@@ -1645,13 +1491,24 @@
           <w:sz w:val="24"/>
         </w:rPr>
         <w:tab/>
-        <w:t xml:space="preserve">  </w:t>
       </w:r>
       <w:r>
         <w:rPr>
           <w:sz w:val="24"/>
         </w:rPr>
         <w:t xml:space="preserve">   </w:t>
+      </w:r>
+      <w:r>
+        <w:rPr>
+          <w:sz w:val="24"/>
+        </w:rPr>
+        <w:t xml:space="preserve"> </w:t>
+      </w:r>
+      <w:r>
+        <w:rPr>
+          <w:sz w:val="24"/>
+        </w:rPr>
+        <w:t xml:space="preserve"> </w:t>
       </w:r>
       <w:r>
         <w:rPr>
@@ -1688,13 +1545,25 @@
         <w:rPr>
           <w:sz w:val="24"/>
         </w:rPr>
-        <w:t>By  _________________________</w:t>
+        <w:t>By  __________________________</w:t>
+      </w:r>
+      <w:r>
+        <w:rPr>
+          <w:sz w:val="24"/>
+        </w:rPr>
+        <w:t>____</w:t>
       </w:r>
       <w:r>
         <w:rPr>
           <w:sz w:val="24"/>
         </w:rPr>
         <w:t>_</w:t>
+      </w:r>
+      <w:r>
+        <w:rPr>
+          <w:sz w:val="24"/>
+        </w:rPr>
+        <w:t>____</w:t>
       </w:r>
     </w:p>
     <w:p>
@@ -1805,335 +1674,18 @@
     </w:p>
     <w:p>
       <w:pPr>
-        <w:rPr>
+        <w:tabs>
+          <w:tab w:val="left" w:pos="5040"/>
+        </w:tabs>
+        <w:rPr>
+          <w:noProof/>
           <w:sz w:val="18"/>
           <w:szCs w:val="18"/>
-          <w:u w:val="single"/>
-        </w:rPr>
-      </w:pPr>
-      <w:r>
-        <w:rPr>
-          <w:sz w:val="18"/>
-          <w:szCs w:val="18"/>
-          <w:u w:val="single"/>
-        </w:rPr>
-        <w:t>CERTIFICATE UNDER 37 CFR 1.8:</w:t>
-      </w:r>
-      <w:r>
-        <w:rPr>
-          <w:sz w:val="18"/>
-          <w:szCs w:val="18"/>
-        </w:rPr>
-        <w:t xml:space="preserve">  The undersigned hereby certifies that this correspondence is being </w:t>
-      </w:r>
-      <w:r>
-        <w:rPr>
-          <w:noProof/>
-          <w:sz w:val="18"/>
-          <w:szCs w:val="18"/>
-        </w:rPr>
-        <w:t>&lt;&lt;certificateText&gt;&gt;</w:t>
-      </w:r>
-      <w:r>
-        <w:rPr>
-          <w:sz w:val="18"/>
-          <w:szCs w:val="18"/>
-        </w:rPr>
-        <w:t xml:space="preserve"> </w:t>
-      </w:r>
-      <w:r>
-        <w:rPr>
-          <w:sz w:val="18"/>
-          <w:szCs w:val="18"/>
-        </w:rPr>
-        <w:t xml:space="preserve">addressed to:  </w:t>
-      </w:r>
-      <w:r>
-        <w:rPr>
-          <w:sz w:val="18"/>
-          <w:szCs w:val="18"/>
-        </w:rPr>
-        <w:t xml:space="preserve">Commissioner for Patents, </w:t>
-      </w:r>
-      <w:smartTag w:uri="urn:schemas-microsoft-com:office:smarttags" w:element="address">
-        <w:smartTag w:uri="urn:schemas-microsoft-com:office:smarttags" w:element="Street">
-          <w:r>
-            <w:rPr>
-              <w:sz w:val="18"/>
-              <w:szCs w:val="18"/>
-            </w:rPr>
-            <w:t>P.O. Box 1450</w:t>
-          </w:r>
-        </w:smartTag>
-        <w:r>
-          <w:rPr>
-            <w:sz w:val="18"/>
-            <w:szCs w:val="18"/>
-          </w:rPr>
-          <w:t xml:space="preserve">, </w:t>
-        </w:r>
-        <w:smartTag w:uri="urn:schemas-microsoft-com:office:smarttags" w:element="country-region">
-          <w:r>
-            <w:rPr>
-              <w:sz w:val="18"/>
-              <w:szCs w:val="18"/>
-            </w:rPr>
-            <w:t>Alexandria</w:t>
-          </w:r>
-        </w:smartTag>
-        <w:r>
-          <w:rPr>
-            <w:sz w:val="18"/>
-            <w:szCs w:val="18"/>
-          </w:rPr>
-          <w:t xml:space="preserve">, </w:t>
-        </w:r>
-        <w:smartTag w:uri="urn:schemas-microsoft-com:office:smarttags" w:element="State">
-          <w:r>
-            <w:rPr>
-              <w:sz w:val="18"/>
-              <w:szCs w:val="18"/>
-            </w:rPr>
-            <w:t>VA</w:t>
-          </w:r>
-        </w:smartTag>
-        <w:r>
-          <w:rPr>
-            <w:sz w:val="18"/>
-            <w:szCs w:val="18"/>
-          </w:rPr>
-          <w:t xml:space="preserve"> </w:t>
-        </w:r>
-        <w:smartTag w:uri="urn:schemas-microsoft-com:office:smarttags" w:element="PostalCode">
-          <w:r>
-            <w:rPr>
-              <w:sz w:val="18"/>
-              <w:szCs w:val="18"/>
-            </w:rPr>
-            <w:t>22313-1450</w:t>
-          </w:r>
-        </w:smartTag>
-      </w:smartTag>
-      <w:r>
-        <w:rPr>
-          <w:sz w:val="18"/>
-          <w:szCs w:val="18"/>
-        </w:rPr>
-        <w:t xml:space="preserve"> on this </w:t>
-      </w:r>
-      <w:r>
-        <w:rPr>
-          <w:sz w:val="18"/>
-          <w:szCs w:val="18"/>
-          <w:u w:val="single"/>
-        </w:rPr>
-        <w:t xml:space="preserve">          </w:t>
-      </w:r>
-      <w:r>
-        <w:rPr>
-          <w:sz w:val="18"/>
-          <w:szCs w:val="18"/>
-        </w:rPr>
-        <w:t xml:space="preserve"> day of</w:t>
-      </w:r>
-      <w:r>
-        <w:rPr>
-          <w:sz w:val="18"/>
-          <w:szCs w:val="18"/>
-        </w:rPr>
-        <w:t xml:space="preserve"> &lt;&lt;currentMo&gt;&gt;</w:t>
-      </w:r>
-      <w:r>
-        <w:rPr>
-          <w:sz w:val="18"/>
-          <w:szCs w:val="18"/>
-        </w:rPr>
-        <w:t>,</w:t>
-      </w:r>
-      <w:r>
-        <w:rPr>
-          <w:sz w:val="18"/>
-          <w:szCs w:val="18"/>
-        </w:rPr>
-        <w:t xml:space="preserve"> &lt;&lt;currentYr&gt;&gt;</w:t>
-      </w:r>
-      <w:r>
-        <w:rPr>
-          <w:sz w:val="18"/>
-          <w:szCs w:val="18"/>
-        </w:rPr>
-        <w:t>.</w:t>
-      </w:r>
-    </w:p>
-    <w:p>
-      <w:pPr>
-        <w:rPr>
-          <w:sz w:val="18"/>
-          <w:szCs w:val="18"/>
-        </w:rPr>
-      </w:pPr>
-    </w:p>
-    <w:p>
-      <w:pPr>
-        <w:tabs>
-          <w:tab w:val="left" w:pos="4320"/>
-        </w:tabs>
-        <w:jc w:val="both"/>
-        <w:rPr>
-          <w:noProof/>
-          <w:sz w:val="18"/>
-          <w:szCs w:val="18"/>
-        </w:rPr>
-      </w:pPr>
-      <w:r>
-        <w:rPr>
-          <w:noProof/>
-          <w:sz w:val="18"/>
-          <w:szCs w:val="18"/>
-        </w:rPr>
-        <w:t>_______________</w:t>
-      </w:r>
-      <w:r>
-        <w:rPr>
-          <w:noProof/>
-          <w:sz w:val="18"/>
-          <w:szCs w:val="18"/>
-        </w:rPr>
-        <w:t>___________________________</w:t>
-      </w:r>
-      <w:r>
-        <w:rPr>
-          <w:noProof/>
-          <w:sz w:val="18"/>
-          <w:szCs w:val="18"/>
-        </w:rPr>
-        <w:t>________</w:t>
-      </w:r>
-      <w:r>
-        <w:rPr>
-          <w:noProof/>
-          <w:sz w:val="18"/>
-          <w:szCs w:val="18"/>
-        </w:rPr>
-        <w:tab/>
-        <w:t>__________________________________________________________</w:t>
-      </w:r>
-    </w:p>
-    <w:p>
-      <w:pPr>
-        <w:tabs>
-          <w:tab w:val="left" w:pos="5040"/>
-        </w:tabs>
-        <w:rPr>
-          <w:noProof/>
-          <w:sz w:val="18"/>
-          <w:szCs w:val="18"/>
-        </w:rPr>
-      </w:pPr>
-      <w:r>
-        <w:rPr>
-          <w:noProof/>
-          <w:sz w:val="18"/>
-          <w:szCs w:val="18"/>
-        </w:rPr>
-        <w:t>Name</w:t>
-      </w:r>
-      <w:r>
-        <w:rPr>
-          <w:noProof/>
-          <w:sz w:val="18"/>
-          <w:szCs w:val="18"/>
-        </w:rPr>
-        <w:tab/>
-        <w:t>Signature</w:t>
-      </w:r>
-    </w:p>
-    <w:p>
-      <w:pPr>
-        <w:tabs>
-          <w:tab w:val="left" w:pos="5040"/>
-        </w:tabs>
-        <w:rPr>
-          <w:noProof/>
-          <w:sz w:val="18"/>
-          <w:szCs w:val="18"/>
-        </w:rPr>
-      </w:pPr>
-    </w:p>
-    <w:p>
-      <w:pPr>
-        <w:tabs>
-          <w:tab w:val="left" w:pos="5040"/>
-        </w:tabs>
-        <w:rPr>
-          <w:noProof/>
-          <w:sz w:val="18"/>
-          <w:szCs w:val="18"/>
-        </w:rPr>
-      </w:pPr>
-    </w:p>
-    <w:p>
-      <w:pPr>
-        <w:tabs>
-          <w:tab w:val="left" w:pos="5040"/>
-        </w:tabs>
-        <w:rPr>
-          <w:noProof/>
-          <w:sz w:val="18"/>
-          <w:szCs w:val="18"/>
-        </w:rPr>
-      </w:pPr>
-    </w:p>
-    <w:p>
-      <w:pPr>
-        <w:tabs>
-          <w:tab w:val="left" w:pos="-720"/>
-          <w:tab w:val="left" w:leader="dot" w:pos="0"/>
-          <w:tab w:val="left" w:pos="489"/>
-          <w:tab w:val="left" w:pos="720"/>
-          <w:tab w:val="left" w:pos="1440"/>
-          <w:tab w:val="left" w:pos="2160"/>
-          <w:tab w:val="left" w:pos="2880"/>
-          <w:tab w:val="left" w:pos="3600"/>
-          <w:tab w:val="left" w:pos="4320"/>
-          <w:tab w:val="left" w:pos="5040"/>
-          <w:tab w:val="left" w:pos="5760"/>
-          <w:tab w:val="left" w:pos="6480"/>
-          <w:tab w:val="left" w:pos="7200"/>
-          <w:tab w:val="left" w:pos="7920"/>
-          <w:tab w:val="left" w:pos="8640"/>
-          <w:tab w:val="left" w:pos="9360"/>
-          <w:tab w:val="left" w:pos="10080"/>
-          <w:tab w:val="left" w:pos="10800"/>
-        </w:tabs>
-        <w:rPr>
-          <w:rFonts w:cs="Times New Roman TUR"/>
-          <w:b/>
-          <w:bCs/>
-          <w:szCs w:val="20"/>
-        </w:rPr>
-        <w:sectPr>
-          <w:endnotePr>
-            <w:numFmt w:val="decimal"/>
-          </w:endnotePr>
-          <w:pgSz w:w="12240" w:h="15840" w:code="1"/>
-          <w:pgMar w:top="720" w:right="720" w:bottom="720" w:left="720" w:header="1440" w:footer="1440" w:gutter="0"/>
-          <w:paperSrc w:first="11" w:other="11"/>
-          <w:cols w:space="720"/>
-          <w:noEndnote/>
-        </w:sectPr>
-      </w:pPr>
-    </w:p>
-    <w:p>
-      <w:pPr>
-        <w:tabs>
-          <w:tab w:val="center" w:pos="3384"/>
-          <w:tab w:val="left" w:pos="3744"/>
-          <w:tab w:val="left" w:pos="4464"/>
-          <w:tab w:val="left" w:pos="5184"/>
-          <w:tab w:val="left" w:pos="5904"/>
-          <w:tab w:val="left" w:pos="6624"/>
-        </w:tabs>
+        </w:rPr>
+      </w:pPr>
+    </w:p>
+    <w:p>
+      <w:pPr>
         <w:rPr>
           <w:lang w:val="fr-FR"/>
         </w:rPr>
@@ -2143,9 +1695,8 @@
       <w:endnotePr>
         <w:numFmt w:val="decimal"/>
       </w:endnotePr>
-      <w:pgSz w:w="13680" w:h="5940" w:orient="landscape" w:code="20"/>
-      <w:pgMar w:top="907" w:right="3456" w:bottom="907" w:left="3456" w:header="907" w:footer="907" w:gutter="0"/>
-      <w:paperSrc w:first="5" w:other="5"/>
+      <w:pgSz w:w="12240" w:h="15840" w:code="1"/>
+      <w:pgMar w:top="720" w:right="907" w:bottom="720" w:left="907" w:header="1296" w:footer="432" w:gutter="0"/>
       <w:cols w:space="720"/>
       <w:noEndnote/>
     </w:sectPr>
@@ -2226,6 +1777,50 @@
     <w:lsdException w:name="Subtitle" w:qFormat="1"/>
     <w:lsdException w:name="Strong" w:qFormat="1"/>
     <w:lsdException w:name="Emphasis" w:qFormat="1"/>
+    <w:lsdException w:name="Normal Table" w:semiHidden="1" w:unhideWhenUsed="1"/>
+    <w:lsdException w:name="Table Simple 1" w:semiHidden="1" w:unhideWhenUsed="1"/>
+    <w:lsdException w:name="Table Simple 2" w:semiHidden="1" w:unhideWhenUsed="1"/>
+    <w:lsdException w:name="Table Simple 3" w:semiHidden="1" w:unhideWhenUsed="1"/>
+    <w:lsdException w:name="Table Classic 1" w:semiHidden="1" w:unhideWhenUsed="1"/>
+    <w:lsdException w:name="Table Classic 2" w:semiHidden="1" w:unhideWhenUsed="1"/>
+    <w:lsdException w:name="Table Classic 3" w:semiHidden="1" w:unhideWhenUsed="1"/>
+    <w:lsdException w:name="Table Classic 4" w:semiHidden="1" w:unhideWhenUsed="1"/>
+    <w:lsdException w:name="Table Colorful 1" w:semiHidden="1" w:unhideWhenUsed="1"/>
+    <w:lsdException w:name="Table Colorful 2" w:semiHidden="1" w:unhideWhenUsed="1"/>
+    <w:lsdException w:name="Table Colorful 3" w:semiHidden="1" w:unhideWhenUsed="1"/>
+    <w:lsdException w:name="Table Columns 1" w:semiHidden="1" w:unhideWhenUsed="1"/>
+    <w:lsdException w:name="Table Columns 2" w:semiHidden="1" w:unhideWhenUsed="1"/>
+    <w:lsdException w:name="Table Columns 3" w:semiHidden="1" w:unhideWhenUsed="1"/>
+    <w:lsdException w:name="Table Columns 4" w:semiHidden="1" w:unhideWhenUsed="1"/>
+    <w:lsdException w:name="Table Columns 5" w:semiHidden="1" w:unhideWhenUsed="1"/>
+    <w:lsdException w:name="Table Grid 1" w:semiHidden="1" w:unhideWhenUsed="1"/>
+    <w:lsdException w:name="Table Grid 2" w:semiHidden="1" w:unhideWhenUsed="1"/>
+    <w:lsdException w:name="Table Grid 3" w:semiHidden="1" w:unhideWhenUsed="1"/>
+    <w:lsdException w:name="Table Grid 4" w:semiHidden="1" w:unhideWhenUsed="1"/>
+    <w:lsdException w:name="Table Grid 5" w:semiHidden="1" w:unhideWhenUsed="1"/>
+    <w:lsdException w:name="Table Grid 6" w:semiHidden="1" w:unhideWhenUsed="1"/>
+    <w:lsdException w:name="Table Grid 7" w:semiHidden="1" w:unhideWhenUsed="1"/>
+    <w:lsdException w:name="Table Grid 8" w:semiHidden="1" w:unhideWhenUsed="1"/>
+    <w:lsdException w:name="Table List 1" w:semiHidden="1" w:unhideWhenUsed="1"/>
+    <w:lsdException w:name="Table List 2" w:semiHidden="1" w:unhideWhenUsed="1"/>
+    <w:lsdException w:name="Table List 3" w:semiHidden="1" w:unhideWhenUsed="1"/>
+    <w:lsdException w:name="Table List 4" w:semiHidden="1" w:unhideWhenUsed="1"/>
+    <w:lsdException w:name="Table List 5" w:semiHidden="1" w:unhideWhenUsed="1"/>
+    <w:lsdException w:name="Table List 6" w:semiHidden="1" w:unhideWhenUsed="1"/>
+    <w:lsdException w:name="Table List 7" w:semiHidden="1" w:unhideWhenUsed="1"/>
+    <w:lsdException w:name="Table List 8" w:semiHidden="1" w:unhideWhenUsed="1"/>
+    <w:lsdException w:name="Table 3D effects 1" w:semiHidden="1" w:unhideWhenUsed="1"/>
+    <w:lsdException w:name="Table 3D effects 2" w:semiHidden="1" w:unhideWhenUsed="1"/>
+    <w:lsdException w:name="Table 3D effects 3" w:semiHidden="1" w:unhideWhenUsed="1"/>
+    <w:lsdException w:name="Table Contemporary" w:semiHidden="1" w:unhideWhenUsed="1"/>
+    <w:lsdException w:name="Table Elegant" w:semiHidden="1" w:unhideWhenUsed="1"/>
+    <w:lsdException w:name="Table Professional" w:semiHidden="1" w:unhideWhenUsed="1"/>
+    <w:lsdException w:name="Table Subtle 1" w:semiHidden="1" w:unhideWhenUsed="1"/>
+    <w:lsdException w:name="Table Subtle 2" w:semiHidden="1" w:unhideWhenUsed="1"/>
+    <w:lsdException w:name="Table Web 1" w:semiHidden="1" w:unhideWhenUsed="1"/>
+    <w:lsdException w:name="Table Web 2" w:semiHidden="1" w:unhideWhenUsed="1"/>
+    <w:lsdException w:name="Table Web 3" w:semiHidden="1" w:unhideWhenUsed="1"/>
+    <w:lsdException w:name="Table Theme" w:semiHidden="1" w:unhideWhenUsed="1"/>
     <w:lsdException w:name="Placeholder Text" w:semiHidden="1" w:uiPriority="99"/>
     <w:lsdException w:name="No Spacing" w:uiPriority="1" w:qFormat="1"/>
     <w:lsdException w:name="Light Shading" w:uiPriority="60"/>
@@ -2535,11 +2130,15 @@
   </w:style>
   <w:style w:type="character" w:default="1" w:styleId="DefaultParagraphFont">
     <w:name w:val="Default Paragraph Font"/>
+    <w:uiPriority w:val="1"/>
     <w:semiHidden/>
+    <w:unhideWhenUsed/>
   </w:style>
   <w:style w:type="table" w:default="1" w:styleId="TableNormal">
     <w:name w:val="Normal Table"/>
+    <w:uiPriority w:val="99"/>
     <w:semiHidden/>
+    <w:unhideWhenUsed/>
     <w:tblPr>
       <w:tblInd w:w="0" w:type="dxa"/>
       <w:tblCellMar>
@@ -2552,7 +2151,9 @@
   </w:style>
   <w:style w:type="numbering" w:default="1" w:styleId="NoList">
     <w:name w:val="No List"/>
+    <w:uiPriority w:val="99"/>
     <w:semiHidden/>
+    <w:unhideWhenUsed/>
   </w:style>
   <w:style w:type="character" w:styleId="FootnoteReference">
     <w:name w:val="footnote reference"/>

</xml_diff>

<commit_message>
Created frct function and implemented in 'incorectfilerect' function.
</commit_message>
<xml_diff>
--- a/project/documents/communications/incorrectfilerect.docx
+++ b/project/documents/communications/incorrectfilerect.docx
@@ -1,6 +1,6 @@
 
 <file path=word/document.xml><?xml version="1.0" encoding="utf-8"?>
-<w:document xmlns:wpc="http://schemas.microsoft.com/office/word/2010/wordprocessingCanvas" xmlns:cx="http://schemas.microsoft.com/office/drawing/2014/chartex" xmlns:cx1="http://schemas.microsoft.com/office/drawing/2015/9/8/chartex" xmlns:cx2="http://schemas.microsoft.com/office/drawing/2015/10/21/chartex" xmlns:cx3="http://schemas.microsoft.com/office/drawing/2016/5/9/chartex" xmlns:cx4="http://schemas.microsoft.com/office/drawing/2016/5/10/chartex" xmlns:cx5="http://schemas.microsoft.com/office/drawing/2016/5/11/chartex" xmlns:cx6="http://schemas.microsoft.com/office/drawing/2016/5/12/chartex" xmlns:cx7="http://schemas.microsoft.com/office/drawing/2016/5/13/chartex" xmlns:cx8="http://schemas.microsoft.com/office/drawing/2016/5/14/chartex" xmlns:mc="http://schemas.openxmlformats.org/markup-compatibility/2006" xmlns:aink="http://schemas.microsoft.com/office/drawing/2016/ink" xmlns:am3d="http://schemas.microsoft.com/office/drawing/2017/model3d" xmlns:o="urn:schemas-microsoft-com:office:office" xmlns:oel="http://schemas.microsoft.com/office/2019/extlst" xmlns:r="http://schemas.openxmlformats.org/officeDocument/2006/relationships" xmlns:m="http://schemas.openxmlformats.org/officeDocument/2006/math" xmlns:v="urn:schemas-microsoft-com:vml" xmlns:wp14="http://schemas.microsoft.com/office/word/2010/wordprocessingDrawing" xmlns:wp="http://schemas.openxmlformats.org/drawingml/2006/wordprocessingDrawing" xmlns:w10="urn:schemas-microsoft-com:office:word" xmlns:w="http://schemas.openxmlformats.org/wordprocessingml/2006/main" xmlns:w14="http://schemas.microsoft.com/office/word/2010/wordml" xmlns:w15="http://schemas.microsoft.com/office/word/2012/wordml" xmlns:w16cex="http://schemas.microsoft.com/office/word/2018/wordml/cex" xmlns:w16cid="http://schemas.microsoft.com/office/word/2016/wordml/cid" xmlns:w16="http://schemas.microsoft.com/office/word/2018/wordml" xmlns:w16sdtdh="http://schemas.microsoft.com/office/word/2020/wordml/sdtdatahash" xmlns:w16se="http://schemas.microsoft.com/office/word/2015/wordml/symex" xmlns:wpg="http://schemas.microsoft.com/office/word/2010/wordprocessingGroup" xmlns:wpi="http://schemas.microsoft.com/office/word/2010/wordprocessingInk" xmlns:wne="http://schemas.microsoft.com/office/word/2006/wordml" xmlns:wps="http://schemas.microsoft.com/office/word/2010/wordprocessingShape" mc:Ignorable="w14 w15 w16se w16cid w16 w16cex w16sdtdh wp14">
+<w:document xmlns:wpc="http://schemas.microsoft.com/office/word/2010/wordprocessingCanvas" xmlns:cx="http://schemas.microsoft.com/office/drawing/2014/chartex" xmlns:cx1="http://schemas.microsoft.com/office/drawing/2015/9/8/chartex" xmlns:cx2="http://schemas.microsoft.com/office/drawing/2015/10/21/chartex" xmlns:cx3="http://schemas.microsoft.com/office/drawing/2016/5/9/chartex" xmlns:cx4="http://schemas.microsoft.com/office/drawing/2016/5/10/chartex" xmlns:cx5="http://schemas.microsoft.com/office/drawing/2016/5/11/chartex" xmlns:cx6="http://schemas.microsoft.com/office/drawing/2016/5/12/chartex" xmlns:cx7="http://schemas.microsoft.com/office/drawing/2016/5/13/chartex" xmlns:cx8="http://schemas.microsoft.com/office/drawing/2016/5/14/chartex" xmlns:mc="http://schemas.openxmlformats.org/markup-compatibility/2006" xmlns:aink="http://schemas.microsoft.com/office/drawing/2016/ink" xmlns:am3d="http://schemas.microsoft.com/office/drawing/2017/model3d" xmlns:o="urn:schemas-microsoft-com:office:office" xmlns:oel="http://schemas.microsoft.com/office/2019/extlst" xmlns:r="http://schemas.openxmlformats.org/officeDocument/2006/relationships" xmlns:m="http://schemas.openxmlformats.org/officeDocument/2006/math" xmlns:v="urn:schemas-microsoft-com:vml" xmlns:wp14="http://schemas.microsoft.com/office/word/2010/wordprocessingDrawing" xmlns:wp="http://schemas.openxmlformats.org/drawingml/2006/wordprocessingDrawing" xmlns:w10="urn:schemas-microsoft-com:office:word" xmlns:w="http://schemas.openxmlformats.org/wordprocessingml/2006/main" xmlns:w14="http://schemas.microsoft.com/office/word/2010/wordml" xmlns:w15="http://schemas.microsoft.com/office/word/2012/wordml" xmlns:w16cex="http://schemas.microsoft.com/office/word/2018/wordml/cex" xmlns:w16cid="http://schemas.microsoft.com/office/word/2016/wordml/cid" xmlns:w16="http://schemas.microsoft.com/office/word/2018/wordml" xmlns:w16du="http://schemas.microsoft.com/office/word/2023/wordml/word16du" xmlns:w16sdtdh="http://schemas.microsoft.com/office/word/2020/wordml/sdtdatahash" xmlns:w16sdtfl="http://schemas.microsoft.com/office/word/2024/wordml/sdtformatlock" xmlns:w16se="http://schemas.microsoft.com/office/word/2015/wordml/symex" xmlns:wpg="http://schemas.microsoft.com/office/word/2010/wordprocessingGroup" xmlns:wpi="http://schemas.microsoft.com/office/word/2010/wordprocessingInk" xmlns:wne="http://schemas.microsoft.com/office/word/2006/wordml" xmlns:wps="http://schemas.microsoft.com/office/word/2010/wordprocessingShape" mc:Ignorable="w14 w15 w16se w16cid w16 w16cex w16sdtdh w16sdtfl w16du wp14">
   <w:body>
     <w:p>
       <w:pPr>
@@ -833,6 +833,7 @@
           <w:rFonts w:cs="Times New Roman TUR"/>
           <w:sz w:val="24"/>
         </w:rPr>
+        <w:lastRenderedPageBreak/>
         <w:tab/>
       </w:r>
       <w:r>
@@ -1603,45 +1604,12 @@
     <w:p>
       <w:pPr>
         <w:tabs>
-          <w:tab w:val="left" w:pos="-720"/>
           <w:tab w:val="left" w:pos="6300"/>
         </w:tabs>
         <w:rPr>
           <w:sz w:val="24"/>
         </w:rPr>
       </w:pPr>
-      <w:r>
-        <w:rPr>
-          <w:rFonts w:cs="Dutch801 Rm BT"/>
-          <w:sz w:val="18"/>
-          <w:szCs w:val="18"/>
-        </w:rPr>
-        <w:t>&lt;</w:t>
-      </w:r>
-      <w:r>
-        <w:rPr>
-          <w:rFonts w:cs="Dutch801 Rm BT"/>
-          <w:sz w:val="18"/>
-          <w:szCs w:val="18"/>
-        </w:rPr>
-        <w:t>&lt;nickSA&gt;&gt;</w:t>
-      </w:r>
-      <w:r>
-        <w:rPr>
-          <w:rFonts w:cs="Dutch801 Rm BT"/>
-          <w:sz w:val="18"/>
-          <w:szCs w:val="18"/>
-        </w:rPr>
-        <w:t>:CMG:</w:t>
-      </w:r>
-      <w:r>
-        <w:rPr>
-          <w:rFonts w:cs="Dutch801 Rm BT"/>
-          <w:sz w:val="18"/>
-          <w:szCs w:val="18"/>
-        </w:rPr>
-        <w:t>&lt;&lt;nickU&gt;&gt;</w:t>
-      </w:r>
       <w:r>
         <w:rPr>
           <w:sz w:val="24"/>
@@ -1713,7 +1681,7 @@
 </file>
 
 <file path=word/endnotes.xml><?xml version="1.0" encoding="utf-8"?>
-<w:endnotes xmlns:wpc="http://schemas.microsoft.com/office/word/2010/wordprocessingCanvas" xmlns:cx="http://schemas.microsoft.com/office/drawing/2014/chartex" xmlns:cx1="http://schemas.microsoft.com/office/drawing/2015/9/8/chartex" xmlns:cx2="http://schemas.microsoft.com/office/drawing/2015/10/21/chartex" xmlns:cx3="http://schemas.microsoft.com/office/drawing/2016/5/9/chartex" xmlns:cx4="http://schemas.microsoft.com/office/drawing/2016/5/10/chartex" xmlns:cx5="http://schemas.microsoft.com/office/drawing/2016/5/11/chartex" xmlns:cx6="http://schemas.microsoft.com/office/drawing/2016/5/12/chartex" xmlns:cx7="http://schemas.microsoft.com/office/drawing/2016/5/13/chartex" xmlns:cx8="http://schemas.microsoft.com/office/drawing/2016/5/14/chartex" xmlns:mc="http://schemas.openxmlformats.org/markup-compatibility/2006" xmlns:aink="http://schemas.microsoft.com/office/drawing/2016/ink" xmlns:am3d="http://schemas.microsoft.com/office/drawing/2017/model3d" xmlns:o="urn:schemas-microsoft-com:office:office" xmlns:oel="http://schemas.microsoft.com/office/2019/extlst" xmlns:r="http://schemas.openxmlformats.org/officeDocument/2006/relationships" xmlns:m="http://schemas.openxmlformats.org/officeDocument/2006/math" xmlns:v="urn:schemas-microsoft-com:vml" xmlns:wp14="http://schemas.microsoft.com/office/word/2010/wordprocessingDrawing" xmlns:wp="http://schemas.openxmlformats.org/drawingml/2006/wordprocessingDrawing" xmlns:w10="urn:schemas-microsoft-com:office:word" xmlns:w="http://schemas.openxmlformats.org/wordprocessingml/2006/main" xmlns:w14="http://schemas.microsoft.com/office/word/2010/wordml" xmlns:w15="http://schemas.microsoft.com/office/word/2012/wordml" xmlns:w16cex="http://schemas.microsoft.com/office/word/2018/wordml/cex" xmlns:w16cid="http://schemas.microsoft.com/office/word/2016/wordml/cid" xmlns:w16="http://schemas.microsoft.com/office/word/2018/wordml" xmlns:w16sdtdh="http://schemas.microsoft.com/office/word/2020/wordml/sdtdatahash" xmlns:w16se="http://schemas.microsoft.com/office/word/2015/wordml/symex" xmlns:wpg="http://schemas.microsoft.com/office/word/2010/wordprocessingGroup" xmlns:wpi="http://schemas.microsoft.com/office/word/2010/wordprocessingInk" xmlns:wne="http://schemas.microsoft.com/office/word/2006/wordml" xmlns:wps="http://schemas.microsoft.com/office/word/2010/wordprocessingShape" mc:Ignorable="w14 w15 w16se w16cid w16 w16cex w16sdtdh wp14">
+<w:endnotes xmlns:wpc="http://schemas.microsoft.com/office/word/2010/wordprocessingCanvas" xmlns:cx="http://schemas.microsoft.com/office/drawing/2014/chartex" xmlns:cx1="http://schemas.microsoft.com/office/drawing/2015/9/8/chartex" xmlns:cx2="http://schemas.microsoft.com/office/drawing/2015/10/21/chartex" xmlns:cx3="http://schemas.microsoft.com/office/drawing/2016/5/9/chartex" xmlns:cx4="http://schemas.microsoft.com/office/drawing/2016/5/10/chartex" xmlns:cx5="http://schemas.microsoft.com/office/drawing/2016/5/11/chartex" xmlns:cx6="http://schemas.microsoft.com/office/drawing/2016/5/12/chartex" xmlns:cx7="http://schemas.microsoft.com/office/drawing/2016/5/13/chartex" xmlns:cx8="http://schemas.microsoft.com/office/drawing/2016/5/14/chartex" xmlns:mc="http://schemas.openxmlformats.org/markup-compatibility/2006" xmlns:aink="http://schemas.microsoft.com/office/drawing/2016/ink" xmlns:am3d="http://schemas.microsoft.com/office/drawing/2017/model3d" xmlns:o="urn:schemas-microsoft-com:office:office" xmlns:oel="http://schemas.microsoft.com/office/2019/extlst" xmlns:r="http://schemas.openxmlformats.org/officeDocument/2006/relationships" xmlns:m="http://schemas.openxmlformats.org/officeDocument/2006/math" xmlns:v="urn:schemas-microsoft-com:vml" xmlns:wp14="http://schemas.microsoft.com/office/word/2010/wordprocessingDrawing" xmlns:wp="http://schemas.openxmlformats.org/drawingml/2006/wordprocessingDrawing" xmlns:w10="urn:schemas-microsoft-com:office:word" xmlns:w="http://schemas.openxmlformats.org/wordprocessingml/2006/main" xmlns:w14="http://schemas.microsoft.com/office/word/2010/wordml" xmlns:w15="http://schemas.microsoft.com/office/word/2012/wordml" xmlns:w16cex="http://schemas.microsoft.com/office/word/2018/wordml/cex" xmlns:w16cid="http://schemas.microsoft.com/office/word/2016/wordml/cid" xmlns:w16="http://schemas.microsoft.com/office/word/2018/wordml" xmlns:w16du="http://schemas.microsoft.com/office/word/2023/wordml/word16du" xmlns:w16sdtdh="http://schemas.microsoft.com/office/word/2020/wordml/sdtdatahash" xmlns:w16sdtfl="http://schemas.microsoft.com/office/word/2024/wordml/sdtformatlock" xmlns:w16se="http://schemas.microsoft.com/office/word/2015/wordml/symex" xmlns:wpg="http://schemas.microsoft.com/office/word/2010/wordprocessingGroup" xmlns:wpi="http://schemas.microsoft.com/office/word/2010/wordprocessingInk" xmlns:wne="http://schemas.microsoft.com/office/word/2006/wordml" xmlns:wps="http://schemas.microsoft.com/office/word/2010/wordprocessingShape" mc:Ignorable="w14 w15 w16se w16cid w16 w16cex w16sdtdh w16sdtfl w16du wp14">
   <w:endnote w:type="separator" w:id="-1">
     <w:p>
       <w:r>
@@ -1732,7 +1700,7 @@
 </file>
 
 <file path=word/footnotes.xml><?xml version="1.0" encoding="utf-8"?>
-<w:footnotes xmlns:wpc="http://schemas.microsoft.com/office/word/2010/wordprocessingCanvas" xmlns:cx="http://schemas.microsoft.com/office/drawing/2014/chartex" xmlns:cx1="http://schemas.microsoft.com/office/drawing/2015/9/8/chartex" xmlns:cx2="http://schemas.microsoft.com/office/drawing/2015/10/21/chartex" xmlns:cx3="http://schemas.microsoft.com/office/drawing/2016/5/9/chartex" xmlns:cx4="http://schemas.microsoft.com/office/drawing/2016/5/10/chartex" xmlns:cx5="http://schemas.microsoft.com/office/drawing/2016/5/11/chartex" xmlns:cx6="http://schemas.microsoft.com/office/drawing/2016/5/12/chartex" xmlns:cx7="http://schemas.microsoft.com/office/drawing/2016/5/13/chartex" xmlns:cx8="http://schemas.microsoft.com/office/drawing/2016/5/14/chartex" xmlns:mc="http://schemas.openxmlformats.org/markup-compatibility/2006" xmlns:aink="http://schemas.microsoft.com/office/drawing/2016/ink" xmlns:am3d="http://schemas.microsoft.com/office/drawing/2017/model3d" xmlns:o="urn:schemas-microsoft-com:office:office" xmlns:oel="http://schemas.microsoft.com/office/2019/extlst" xmlns:r="http://schemas.openxmlformats.org/officeDocument/2006/relationships" xmlns:m="http://schemas.openxmlformats.org/officeDocument/2006/math" xmlns:v="urn:schemas-microsoft-com:vml" xmlns:wp14="http://schemas.microsoft.com/office/word/2010/wordprocessingDrawing" xmlns:wp="http://schemas.openxmlformats.org/drawingml/2006/wordprocessingDrawing" xmlns:w10="urn:schemas-microsoft-com:office:word" xmlns:w="http://schemas.openxmlformats.org/wordprocessingml/2006/main" xmlns:w14="http://schemas.microsoft.com/office/word/2010/wordml" xmlns:w15="http://schemas.microsoft.com/office/word/2012/wordml" xmlns:w16cex="http://schemas.microsoft.com/office/word/2018/wordml/cex" xmlns:w16cid="http://schemas.microsoft.com/office/word/2016/wordml/cid" xmlns:w16="http://schemas.microsoft.com/office/word/2018/wordml" xmlns:w16sdtdh="http://schemas.microsoft.com/office/word/2020/wordml/sdtdatahash" xmlns:w16se="http://schemas.microsoft.com/office/word/2015/wordml/symex" xmlns:wpg="http://schemas.microsoft.com/office/word/2010/wordprocessingGroup" xmlns:wpi="http://schemas.microsoft.com/office/word/2010/wordprocessingInk" xmlns:wne="http://schemas.microsoft.com/office/word/2006/wordml" xmlns:wps="http://schemas.microsoft.com/office/word/2010/wordprocessingShape" mc:Ignorable="w14 w15 w16se w16cid w16 w16cex w16sdtdh wp14">
+<w:footnotes xmlns:wpc="http://schemas.microsoft.com/office/word/2010/wordprocessingCanvas" xmlns:cx="http://schemas.microsoft.com/office/drawing/2014/chartex" xmlns:cx1="http://schemas.microsoft.com/office/drawing/2015/9/8/chartex" xmlns:cx2="http://schemas.microsoft.com/office/drawing/2015/10/21/chartex" xmlns:cx3="http://schemas.microsoft.com/office/drawing/2016/5/9/chartex" xmlns:cx4="http://schemas.microsoft.com/office/drawing/2016/5/10/chartex" xmlns:cx5="http://schemas.microsoft.com/office/drawing/2016/5/11/chartex" xmlns:cx6="http://schemas.microsoft.com/office/drawing/2016/5/12/chartex" xmlns:cx7="http://schemas.microsoft.com/office/drawing/2016/5/13/chartex" xmlns:cx8="http://schemas.microsoft.com/office/drawing/2016/5/14/chartex" xmlns:mc="http://schemas.openxmlformats.org/markup-compatibility/2006" xmlns:aink="http://schemas.microsoft.com/office/drawing/2016/ink" xmlns:am3d="http://schemas.microsoft.com/office/drawing/2017/model3d" xmlns:o="urn:schemas-microsoft-com:office:office" xmlns:oel="http://schemas.microsoft.com/office/2019/extlst" xmlns:r="http://schemas.openxmlformats.org/officeDocument/2006/relationships" xmlns:m="http://schemas.openxmlformats.org/officeDocument/2006/math" xmlns:v="urn:schemas-microsoft-com:vml" xmlns:wp14="http://schemas.microsoft.com/office/word/2010/wordprocessingDrawing" xmlns:wp="http://schemas.openxmlformats.org/drawingml/2006/wordprocessingDrawing" xmlns:w10="urn:schemas-microsoft-com:office:word" xmlns:w="http://schemas.openxmlformats.org/wordprocessingml/2006/main" xmlns:w14="http://schemas.microsoft.com/office/word/2010/wordml" xmlns:w15="http://schemas.microsoft.com/office/word/2012/wordml" xmlns:w16cex="http://schemas.microsoft.com/office/word/2018/wordml/cex" xmlns:w16cid="http://schemas.microsoft.com/office/word/2016/wordml/cid" xmlns:w16="http://schemas.microsoft.com/office/word/2018/wordml" xmlns:w16du="http://schemas.microsoft.com/office/word/2023/wordml/word16du" xmlns:w16sdtdh="http://schemas.microsoft.com/office/word/2020/wordml/sdtdatahash" xmlns:w16sdtfl="http://schemas.microsoft.com/office/word/2024/wordml/sdtformatlock" xmlns:w16se="http://schemas.microsoft.com/office/word/2015/wordml/symex" xmlns:wpg="http://schemas.microsoft.com/office/word/2010/wordprocessingGroup" xmlns:wpi="http://schemas.microsoft.com/office/word/2010/wordprocessingInk" xmlns:wne="http://schemas.microsoft.com/office/word/2006/wordml" xmlns:wps="http://schemas.microsoft.com/office/word/2010/wordprocessingShape" mc:Ignorable="w14 w15 w16se w16cid w16 w16cex w16sdtdh w16sdtfl w16du wp14">
   <w:footnote w:type="separator" w:id="-1">
     <w:p>
       <w:r>
@@ -1751,7 +1719,7 @@
 </file>
 
 <file path=word/styles.xml><?xml version="1.0" encoding="utf-8"?>
-<w:styles xmlns:mc="http://schemas.openxmlformats.org/markup-compatibility/2006" xmlns:r="http://schemas.openxmlformats.org/officeDocument/2006/relationships" xmlns:w="http://schemas.openxmlformats.org/wordprocessingml/2006/main" xmlns:w14="http://schemas.microsoft.com/office/word/2010/wordml" xmlns:w15="http://schemas.microsoft.com/office/word/2012/wordml" xmlns:w16cex="http://schemas.microsoft.com/office/word/2018/wordml/cex" xmlns:w16cid="http://schemas.microsoft.com/office/word/2016/wordml/cid" xmlns:w16="http://schemas.microsoft.com/office/word/2018/wordml" xmlns:w16sdtdh="http://schemas.microsoft.com/office/word/2020/wordml/sdtdatahash" xmlns:w16se="http://schemas.microsoft.com/office/word/2015/wordml/symex" mc:Ignorable="w14 w15 w16se w16cid w16 w16cex w16sdtdh">
+<w:styles xmlns:mc="http://schemas.openxmlformats.org/markup-compatibility/2006" xmlns:r="http://schemas.openxmlformats.org/officeDocument/2006/relationships" xmlns:w="http://schemas.openxmlformats.org/wordprocessingml/2006/main" xmlns:w14="http://schemas.microsoft.com/office/word/2010/wordml" xmlns:w15="http://schemas.microsoft.com/office/word/2012/wordml" xmlns:w16cex="http://schemas.microsoft.com/office/word/2018/wordml/cex" xmlns:w16cid="http://schemas.microsoft.com/office/word/2016/wordml/cid" xmlns:w16="http://schemas.microsoft.com/office/word/2018/wordml" xmlns:w16du="http://schemas.microsoft.com/office/word/2023/wordml/word16du" xmlns:w16sdtdh="http://schemas.microsoft.com/office/word/2020/wordml/sdtdatahash" xmlns:w16sdtfl="http://schemas.microsoft.com/office/word/2024/wordml/sdtformatlock" xmlns:w16se="http://schemas.microsoft.com/office/word/2015/wordml/symex" mc:Ignorable="w14 w15 w16se w16cid w16 w16cex w16sdtdh w16sdtfl w16du">
   <w:docDefaults>
     <w:rPrDefault>
       <w:rPr>

</xml_diff>

<commit_message>
zip option update. Worked on reqtermadj merge.
</commit_message>
<xml_diff>
--- a/project/documents/communications/incorrectfilerect.docx
+++ b/project/documents/communications/incorrectfilerect.docx
@@ -1020,6 +1020,7 @@
         </w:rPr>
       </w:pPr>
       <w:proofErr w:type="spellStart"/>
+      <w:proofErr w:type="gramStart"/>
       <w:r>
         <w:rPr>
           <w:rFonts w:cs="Times New Roman TUR"/>
@@ -1037,6 +1038,7 @@
         </w:rPr>
         <w:t>:</w:t>
       </w:r>
+      <w:proofErr w:type="gramEnd"/>
       <w:r>
         <w:rPr>
           <w:rFonts w:cs="Times New Roman TUR"/>
@@ -1565,7 +1567,15 @@
           <w:sz w:val="24"/>
         </w:rPr>
         <w:tab/>
-        <w:t>Communication Re: Incorrect Filing Receipt (1 pg.</w:t>
+        <w:t xml:space="preserve">Communication Re: Incorrect Filing Receipt (1 </w:t>
+      </w:r>
+      <w:proofErr w:type="gramStart"/>
+      <w:r>
+        <w:rPr>
+          <w:rFonts w:cs="Times New Roman TUR"/>
+          <w:sz w:val="24"/>
+        </w:rPr>
+        <w:t>pg.</w:t>
       </w:r>
       <w:r>
         <w:rPr>
@@ -1574,6 +1584,7 @@
         </w:rPr>
         <w:t>.</w:t>
       </w:r>
+      <w:proofErr w:type="gramEnd"/>
       <w:r>
         <w:rPr>
           <w:rFonts w:cs="Times New Roman TUR"/>
@@ -1898,11 +1909,19 @@
         </w:rPr>
         <w:tab/>
       </w:r>
-      <w:r>
-        <w:rPr>
-          <w:sz w:val="24"/>
-        </w:rPr>
-        <w:t>By  __________________________</w:t>
+      <w:proofErr w:type="gramStart"/>
+      <w:r>
+        <w:rPr>
+          <w:sz w:val="24"/>
+        </w:rPr>
+        <w:t>By  _</w:t>
+      </w:r>
+      <w:proofErr w:type="gramEnd"/>
+      <w:r>
+        <w:rPr>
+          <w:sz w:val="24"/>
+        </w:rPr>
+        <w:t>_________________________</w:t>
       </w:r>
       <w:r>
         <w:rPr>
@@ -1942,7 +1961,27 @@
         <w:rPr>
           <w:sz w:val="24"/>
         </w:rPr>
-        <w:t>: 21186</w:t>
+        <w:t xml:space="preserve">: </w:t>
+      </w:r>
+      <w:r>
+        <w:rPr>
+          <w:sz w:val="24"/>
+        </w:rPr>
+        <w:t>&lt;&lt;</w:t>
+      </w:r>
+      <w:proofErr w:type="spellStart"/>
+      <w:r>
+        <w:rPr>
+          <w:sz w:val="24"/>
+        </w:rPr>
+        <w:t>custNoCorresp</w:t>
+      </w:r>
+      <w:proofErr w:type="spellEnd"/>
+      <w:r>
+        <w:rPr>
+          <w:sz w:val="24"/>
+        </w:rPr>
+        <w:t>&gt;&gt;</w:t>
       </w:r>
       <w:r>
         <w:rPr>

</xml_diff>